<commit_message>
docs(lab4): insert captured test evidence figures
</commit_message>
<xml_diff>
--- a/实验四_软件质量工程与AI辅助代码审查/D4-3_自动化测试代码与运行报告/README.docx
+++ b/实验四_软件质量工程与AI辅助代码审查/D4-3_自动化测试代码与运行报告/README.docx
@@ -547,6 +547,59 @@
               <w:t>打开 reports/index.html 查看 HTML 运行报告。</w:t>
             </w:r>
           </w:p>
+          <w:p>
+            <w:pPr>
+              <w:spacing w:before="120" w:after="60"/>
+              <w:jc w:val="center"/>
+            </w:pPr>
+            <w:r>
+              <w:drawing>
+                <wp:inline xmlns:a="http://schemas.openxmlformats.org/drawingml/2006/main" xmlns:pic="http://schemas.openxmlformats.org/drawingml/2006/picture">
+                  <wp:extent cx="6217920" cy="3590733"/>
+                  <wp:docPr id="2" name="Picture 2"/>
+                  <wp:cNvGraphicFramePr>
+                    <a:graphicFrameLocks noChangeAspect="1"/>
+                  </wp:cNvGraphicFramePr>
+                  <a:graphic>
+                    <a:graphicData uri="http://schemas.openxmlformats.org/drawingml/2006/picture">
+                      <pic:pic>
+                        <pic:nvPicPr>
+                          <pic:cNvPr id="0" name="截图1.png"/>
+                          <pic:cNvPicPr/>
+                        </pic:nvPicPr>
+                        <pic:blipFill>
+                          <a:blip r:embed="rId10"/>
+                          <a:stretch>
+                            <a:fillRect/>
+                          </a:stretch>
+                        </pic:blipFill>
+                        <pic:spPr>
+                          <a:xfrm>
+                            <a:off x="0" y="0"/>
+                            <a:ext cx="6217920" cy="3590733"/>
+                          </a:xfrm>
+                          <a:prstGeom prst="rect"/>
+                        </pic:spPr>
+                      </pic:pic>
+                    </a:graphicData>
+                  </a:graphic>
+                </wp:inline>
+              </w:drawing>
+            </w:r>
+          </w:p>
+          <w:p>
+            <w:pPr>
+              <w:spacing w:after="120"/>
+              <w:jc w:val="center"/>
+            </w:pPr>
+            <w:r>
+              <w:rPr>
+                <w:rFonts w:ascii="宋体" w:hAnsi="宋体"/>
+                <w:sz w:val="21"/>
+              </w:rPr>
+              <w:t>图4-3 自动化测试 HTML 运行报告实机截图</w:t>
+            </w:r>
+          </w:p>
           <w:p/>
           <w:p>
             <w:r>

</xml_diff>

<commit_message>
docs(lab4): expand automation and nonfunctional reports
</commit_message>
<xml_diff>
--- a/实验四_软件质量工程与AI辅助代码审查/D4-3_自动化测试代码与运行报告/README.docx
+++ b/实验四_软件质量工程与AI辅助代码审查/D4-3_自动化测试代码与运行报告/README.docx
@@ -334,18 +334,12 @@
     </w:p>
     <w:p>
       <w:pPr>
-        <w:spacing w:after="80" w:before="0" w:line="336" w:lineRule="auto"/>
+        <w:spacing w:after="80" w:before="0" w:line="276" w:lineRule="auto"/>
         <w:ind w:firstLine="340"/>
         <w:jc w:val="left"/>
       </w:pPr>
       <w:r>
-        <w:rPr>
-          <w:rFonts w:ascii="Microsoft YaHei" w:hAnsi="Microsoft YaHei" w:eastAsia="Microsoft YaHei"/>
-          <w:b w:val="0"/>
-          <w:color w:val="2B2B2B"/>
-          <w:sz w:val="21"/>
-        </w:rPr>
-        <w:t>本目录提供自动化测试的目录骨架。每个子目录都对应测试金字塔的一层。</w:t>
+        <w:t>本目录提供实验四自动化质量工程的完整证据包：既包含可直接运行的 PoC 业务代码和测试代码，也包含 HTML/JSON/覆盖率/变异测试报告。目录按测试金字塔组织，底层验证纯函数和领域不变量，中层验证服务契约与跨模块流程，上层验证三条核心用户旅程，并通过性能与安全脚本衔接 D4-4 非功能测试报告。</w:t>
       </w:r>
     </w:p>
     <w:p>
@@ -630,6 +624,214 @@
       </w:tr>
     </w:tbl>
     <w:p/>
+    <w:p>
+      <w:pPr>
+        <w:spacing w:before="160" w:after="80"/>
+      </w:pPr>
+      <w:r>
+        <w:rPr>
+          <w:b/>
+          <w:sz w:val="24"/>
+        </w:rPr>
+        <w:t>运行结果摘要</w:t>
+      </w:r>
+    </w:p>
+    <w:p>
+      <w:pPr>
+        <w:spacing w:after="80" w:line="276" w:lineRule="auto"/>
+      </w:pPr>
+      <w:r>
+        <w:rPr>
+          <w:b/>
+        </w:rPr>
+        <w:t>执行时间：</w:t>
+      </w:r>
+      <w:r>
+        <w:t>2026-06-05 16:05:43，本次运行由 tools/run_tests.py 生成 reports/index.html 与 reports/test-results.json；运行结果为 PASS。</w:t>
+      </w:r>
+    </w:p>
+    <w:p>
+      <w:pPr>
+        <w:spacing w:after="80" w:line="276" w:lineRule="auto"/>
+      </w:pPr>
+      <w:r>
+        <w:rPr>
+          <w:b/>
+        </w:rPr>
+        <w:t>测试规模：</w:t>
+      </w:r>
+      <w:r>
+        <w:t>共执行 38 条自动化测试，失败 0、错误 0、跳过 0，覆盖单元、属性、契约、集成和 E2E 五类测试。</w:t>
+      </w:r>
+    </w:p>
+    <w:p>
+      <w:pPr>
+        <w:spacing w:after="80" w:line="276" w:lineRule="auto"/>
+      </w:pPr>
+      <w:r>
+        <w:rPr>
+          <w:b/>
+        </w:rPr>
+        <w:t>覆盖率结果：</w:t>
+      </w:r>
+      <w:r>
+        <w:t>行覆盖率为 72.5%（79/109），分支覆盖率为 70.0%（28/40），达到实验四任务书中行覆盖率 ≥ 70%、分支覆盖率 ≥ 60% 的要求。</w:t>
+      </w:r>
+    </w:p>
+    <w:p>
+      <w:pPr>
+        <w:spacing w:after="80" w:line="276" w:lineRule="auto"/>
+      </w:pPr>
+      <w:r>
+        <w:rPr>
+          <w:b/>
+        </w:rPr>
+        <w:t>变异测试结果：</w:t>
+      </w:r>
+      <w:r>
+        <w:t>mutation_check.py 设计 9 个轻量变异样本，杀死 8 个，变异分数为 88.9%，超过任务书要求的 60%。唯一存活变异体为“押金非负保护删除”，已作为后续补强项记录。</w:t>
+      </w:r>
+    </w:p>
+    <w:p>
+      <w:pPr>
+        <w:spacing w:before="160" w:after="80"/>
+      </w:pPr>
+      <w:r>
+        <w:rPr>
+          <w:b/>
+          <w:sz w:val="24"/>
+        </w:rPr>
+        <w:t>测试层级说明</w:t>
+      </w:r>
+    </w:p>
+    <w:p>
+      <w:pPr>
+        <w:spacing w:after="80" w:line="276" w:lineRule="auto"/>
+      </w:pPr>
+      <w:r>
+        <w:t>单元测试：14 条，重点覆盖预约创建、容量校验、时间边界、橘猫语义识别、取消幂等、手机号脱敏和备注转义。</w:t>
+      </w:r>
+    </w:p>
+    <w:p>
+      <w:pPr>
+        <w:spacing w:after="80" w:line="276" w:lineRule="auto"/>
+      </w:pPr>
+      <w:r>
+        <w:t>属性测试：5 条，用确定性样本模拟 PBT，验证手机号脱敏不可逆、押金非负、时段随预约时长收缩、语义分类稳定和备注安全。</w:t>
+      </w:r>
+    </w:p>
+    <w:p>
+      <w:pPr>
+        <w:spacing w:after="80" w:line="276" w:lineRule="auto"/>
+      </w:pPr>
+      <w:r>
+        <w:t>契约测试：4 条，验证 3 对消费者-提供者契约文件存在且字段、状态码、错误 schema 可被消费者解析。</w:t>
+      </w:r>
+    </w:p>
+    <w:p>
+      <w:pPr>
+        <w:spacing w:after="80" w:line="276" w:lineRule="auto"/>
+      </w:pPr>
+      <w:r>
+        <w:t>集成测试：12 条，覆盖预约落库、取消状态、幂等、容量错误不落库、手机号错误不落库、未来日期边界和 HTML 转义。</w:t>
+      </w:r>
+    </w:p>
+    <w:p>
+      <w:pPr>
+        <w:spacing w:after="80" w:line="276" w:lineRule="auto"/>
+      </w:pPr>
+      <w:r>
+        <w:t>E2E 测试：3 条，覆盖新用户预约取消、老会员推荐下单评价、店员接单调度完单三条课程任务书要求的核心旅程。</w:t>
+      </w:r>
+    </w:p>
+    <w:p>
+      <w:pPr>
+        <w:spacing w:before="160" w:after="80"/>
+      </w:pPr>
+      <w:r>
+        <w:rPr>
+          <w:b/>
+          <w:sz w:val="24"/>
+        </w:rPr>
+        <w:t>报告文件与审计方式</w:t>
+      </w:r>
+    </w:p>
+    <w:p>
+      <w:pPr>
+        <w:spacing w:after="80" w:line="276" w:lineRule="auto"/>
+      </w:pPr>
+      <w:r>
+        <w:t>reports/index.html：HTML 可视化运行报告，适合截图提交，展示测试总数、失败数、覆盖率、变异分数和测试输出。</w:t>
+      </w:r>
+    </w:p>
+    <w:p>
+      <w:pPr>
+        <w:spacing w:after="80" w:line="276" w:lineRule="auto"/>
+      </w:pPr>
+      <w:r>
+        <w:t>reports/test-results.json：机器可读结果文件，可被 CI、质量看板或脚本读取，用于后续 D4-7 质量度量汇总。</w:t>
+      </w:r>
+    </w:p>
+    <w:p>
+      <w:pPr>
+        <w:spacing w:after="80" w:line="276" w:lineRule="auto"/>
+      </w:pPr>
+      <w:r>
+        <w:t>reports/coverage-summary.txt：覆盖率摘要，保留行覆盖率和分支覆盖率的计算结果。</w:t>
+      </w:r>
+    </w:p>
+    <w:p>
+      <w:pPr>
+        <w:spacing w:after="80" w:line="276" w:lineRule="auto"/>
+      </w:pPr>
+      <w:r>
+        <w:t>reports/mutation-summary.md：变异检查明细，记录每个变异样本的状态和存活项。</w:t>
+      </w:r>
+    </w:p>
+    <w:p>
+      <w:pPr>
+        <w:spacing w:before="160" w:after="80"/>
+      </w:pPr>
+      <w:r>
+        <w:rPr>
+          <w:b/>
+          <w:sz w:val="24"/>
+        </w:rPr>
+        <w:t>CI 迁移与门禁建议</w:t>
+      </w:r>
+    </w:p>
+    <w:p>
+      <w:pPr>
+        <w:spacing w:after="80" w:line="276" w:lineRule="auto"/>
+      </w:pPr>
+      <w:r>
+        <w:t>PR 门禁：运行 python tools/run_tests.py，若 38 条回归测试任一失败，则阻断合并。</w:t>
+      </w:r>
+    </w:p>
+    <w:p>
+      <w:pPr>
+        <w:spacing w:after="80" w:line="276" w:lineRule="auto"/>
+      </w:pPr>
+      <w:r>
+        <w:t>发布门禁：运行 python tools/mutation_check.py，若变异分数低于 60% 或出现新的 P0 变异存活，则要求补充测试后再发布。</w:t>
+      </w:r>
+    </w:p>
+    <w:p>
+      <w:pPr>
+        <w:spacing w:after="80" w:line="276" w:lineRule="auto"/>
+      </w:pPr>
+      <w:r>
+        <w:t>证据上传：CI 失败或发布候选构建时上传 reports/ 目录作为 Actions artifact，便于教师或团队成员复核。</w:t>
+      </w:r>
+    </w:p>
+    <w:p>
+      <w:pPr>
+        <w:spacing w:after="80" w:line="276" w:lineRule="auto"/>
+      </w:pPr>
+      <w:r>
+        <w:t>扩展方向：正式项目可将当前轻量覆盖统计迁移到 pytest-cov，将变异检查迁移到 mutmut/cosmic-ray，将 E2E 脚本迁移到 Playwright 真浏览器执行。</w:t>
+      </w:r>
+    </w:p>
     <w:sectPr>
       <w:pgSz w:w="12240" w:h="15840"/>
       <w:pgMar w:top="1134" w:right="1247" w:bottom="1134" w:left="1247" w:header="720" w:footer="720" w:gutter="0"/>

</xml_diff>